<commit_message>
Integration test: evidence with migration 004 (fresh build, upgrade from main, latest CI run)
</commit_message>
<xml_diff>
--- a/docs/07_Integration_Test.docx
+++ b/docs/07_Integration_Test.docx
@@ -608,7 +608,7 @@
               <w:pStyle w:val="Compact"/>
             </w:pPr>
             <w:r>
-              <w:t xml:space="preserve">All 3 migrations applied, all 36 steps and all 36 checks pass, all tests pass</w:t>
+              <w:t xml:space="preserve">All 4 migrations applied, all 36 steps and all 36 checks pass, all tests pass</w:t>
             </w:r>
           </w:p>
         </w:tc>
@@ -632,7 +632,7 @@
               <w:pStyle w:val="Compact"/>
             </w:pPr>
             <w:r>
-              <w:t xml:space="preserve">As expected. 1,228 rows refused. 1,200 orders in raw became 1,116 good orders + 84 refused. fact_sales has 2,567 rows, fact_logins 2,548. 20 tests passed</w:t>
+              <w:t xml:space="preserve">As expected: migrations 001 to 004 applied. 1,228 rows refused. 1,200 orders in raw became 1,116 good orders + 84 refused. fact_sales has 2,567 rows, fact_logins 2,548. 20 tests passed</w:t>
             </w:r>
           </w:p>
         </w:tc>
@@ -1552,7 +1552,7 @@
               <w:pStyle w:val="Compact"/>
             </w:pPr>
             <w:r>
-              <w:t xml:space="preserve">Loaded an empty warehouse with the previous release (commit c0a0ae1, before history for products and the change table). Then ran the new code with --incremental, then the tests</w:t>
+              <w:t xml:space="preserve">Built a warehouse with the previous release, then ran the new code on top of it, then the tests. Done twice: from commit c0a0ae1 (before history for products and the change table), and from main at commit 31b929e (before the fact_logins key, in CI run 39740239039)</w:t>
             </w:r>
           </w:p>
         </w:tc>
@@ -1576,7 +1576,7 @@
               <w:pStyle w:val="Compact"/>
             </w:pPr>
             <w:r>
-              <w:t xml:space="preserve">Migration 003 runs once. The old order watermarks are cleared, so the incremental run becomes a full load. All checks and tests pass</w:t>
+              <w:t xml:space="preserve">Each new migration runs once and the warehouse moves to the new shape by itself. All checks and tests pass</w:t>
             </w:r>
           </w:p>
         </w:tc>
@@ -1600,7 +1600,7 @@
               <w:pStyle w:val="Compact"/>
             </w:pPr>
             <w:r>
-              <w:t xml:space="preserve">'Migration applied: 003_product_and_customer_history.sql', then 'no watermarks yet, so this run is a full load'. 36 checks passed, 20 tests passed</w:t>
+              <w:t xml:space="preserve">From c0a0ae1: 'Migration applied: 003_product_and_customer_history.sql', then 'no watermarks yet, so this run is a full load'. From 31b929e: the old code applied 001 to 003, then the new code applied 'Migration applied: 004_fact_logins_key.sql'. Both times 36 checks passed and 20 tests passed</w:t>
             </w:r>
           </w:p>
         </w:tc>
@@ -1670,7 +1670,7 @@
               <w:pStyle w:val="Compact"/>
             </w:pPr>
             <w:r>
-              <w:t xml:space="preserve">Pushed commit 34cefcd to dev. GitHub run: https://github.com/Ali-Debugs/b2b-dw-pg/actions/runs/39715238078</w:t>
+              <w:t xml:space="preserve">Pushed commit 286cef0 (the fact_logins key) to dev. GitHub run: https://github.com/Ali-Debugs/b2b-dw-pg/actions/runs/39740239039</w:t>
             </w:r>
           </w:p>
         </w:tc>
@@ -1718,7 +1718,7 @@
               <w:pStyle w:val="Compact"/>
             </w:pPr>
             <w:r>
-              <w:t xml:space="preserve">Every step succeeded</w:t>
+              <w:t xml:space="preserve">Every step succeeded: the upgrade applied migration 004, 36 checks passed, and the tests passed after each load (20 passed, three times)</w:t>
             </w:r>
           </w:p>
         </w:tc>
@@ -1788,7 +1788,7 @@
               <w:pStyle w:val="Compact"/>
             </w:pPr>
             <w:r>
-              <w:t xml:space="preserve">Merged pull request #9 into main (commit 31b929e). GitHub run: https://github.com/Ali-Debugs/b2b-dw-pg/actions/runs/39715270869</w:t>
+              <w:t xml:space="preserve">Merged pull request #9 into main (commit 31b929e), the latest release. GitHub run: https://github.com/Ali-Debugs/b2b-dw-pg/actions/runs/39715270869</w:t>
             </w:r>
           </w:p>
         </w:tc>

</xml_diff>